<commit_message>
Khac phuc khiem khuyet: Bo sung baseline model, dac trung train AI va muc han che luan van
</commit_message>
<xml_diff>
--- a/Dàn_Ý_Bài_Báo_Khoa_Học.docx
+++ b/Dàn_Ý_Bài_Báo_Khoa_Học.docx
@@ -484,12 +484,8 @@
       <w:r>
         <w:rPr>
           <w:rFonts w:ascii="Times New Roman" w:hAnsi="Times New Roman"/>
-          <w:b/>
-          <w:i w:val="0"/>
-          <w:sz w:val="24"/>
-          <w:rFonts w:ascii="Times New Roman" w:hAnsi="Times New Roman" w:cs="Times New Roman" w:eastAsia="Times New Roman"/>
         </w:rPr>
-        <w:t>2.4. Thuật toán AI dự báo và giải thuật sa thải phụ tải chủ động</w:t>
+        <w:t>2.4. Thuật toán AI dự báo và giải thuật sa thải phụ tải chủ động (Bổ sung: Kỹ thuật trích lọc đặc trưng lag, rolling, calendar và cấu hình siêu tham số của XGBoost/Random Forest)</w:t>
       </w:r>
     </w:p>
     <w:p>
@@ -601,12 +597,8 @@
       <w:r>
         <w:rPr>
           <w:rFonts w:ascii="Times New Roman" w:hAnsi="Times New Roman"/>
-          <w:b/>
-          <w:i w:val="0"/>
-          <w:sz w:val="24"/>
-          <w:rFonts w:ascii="Times New Roman" w:hAnsi="Times New Roman" w:cs="Times New Roman" w:eastAsia="Times New Roman"/>
         </w:rPr>
-        <w:t>3.1. Kết quả thực nghiệm mô hình AI dự báo phụ tải ngắn hạn</w:t>
+        <w:t>3.1. Kết quả thực nghiệm mô hình AI dự báo phụ tải ngắn hạn (Bổ sung: Đối chứng với mô hình baseline Persistence)</w:t>
       </w:r>
     </w:p>
     <w:p>
@@ -787,12 +779,8 @@
       <w:r>
         <w:rPr>
           <w:rFonts w:ascii="Times New Roman" w:hAnsi="Times New Roman"/>
-          <w:b/>
-          <w:i w:val="0"/>
-          <w:sz w:val="26"/>
-          <w:rFonts w:ascii="Times New Roman" w:hAnsi="Times New Roman" w:cs="Times New Roman" w:eastAsia="Times New Roman"/>
         </w:rPr>
-        <w:t>4. KẾT LUẬN VÀ ĐỀ XUẤT</w:t>
+        <w:t>4. KẾT LUẬN VÀ ĐỀ XUẤT (Bổ sung: Mục Hạn chế của đề tài bao gồm thời gian đo ngắn hạn, đo tổng đầu nguồn, chưa tối ưu theo giá điện thời gian thực)</w:t>
       </w:r>
     </w:p>
     <w:p>

</xml_diff>